<commit_message>
Deploying to gh-pages from @ Morrison-Lab/rme@b3f3b7ca8c90d57d737c5a8210bbb7acd421360c 🚀
</commit_message>
<xml_diff>
--- a/chapters/causal-inference.docx
+++ b/chapters/causal-inference.docx
@@ -8690,7 +8690,7 @@
     </w:p>
     <w:bookmarkEnd w:id="32"/>
     <w:bookmarkEnd w:id="33"/>
-    <w:bookmarkStart w:id="62" w:name="sec-causal-observational"/>
+    <w:bookmarkStart w:id="66" w:name="sec-causal-observational"/>
     <w:p>
       <w:pPr>
         <w:pStyle w:val="Heading1"/>
@@ -8699,9 +8699,174 @@
         <w:t xml:space="preserve">6. Observational Studies</w:t>
       </w:r>
     </w:p>
+    <w:tbl>
+      <w:tblPr>
+        <w:tblStyle w:val="Table"/>
+        <w:tblLook w:firstRow="0" w:lastRow="0" w:firstColumn="0" w:lastColumn="0" w:noHBand="0" w:noVBand="0" w:val="0000"/>
+        <w:tblBorders>
+          <w:top w:val="single" w:sz="4" w:space="0" w:color="00A047"/>
+          <w:left w:val="single" w:sz="24" w:space="0" w:color="00A047"/>
+          <w:bottom w:val="single" w:sz="4" w:space="0" w:color="00A047"/>
+          <w:right w:val="single" w:sz="4" w:space="0" w:color="00A047"/>
+        </w:tblBorders>
+        <w:tblCellMar>
+          <w:left w:w="144" w:type="dxa"/>
+          <w:right w:w="144" w:type="dxa"/>
+        </w:tblCellMar>
+        <w:tblLook w:firstRow="0" w:lastRow="0" w:firstColumn="0" w:lastColumn="0" w:noHBand="0" w:noVBand="0" w:val="0000"/>
+      </w:tblPr>
+      <w:tr>
+        <w:trPr>
+          <w:cantSplit/>
+        </w:trPr>
+        <w:tc>
+          <w:tcPr>
+            <w:shd w:color="auto" w:fill="ccf1e3" w:val="clear"/>
+            <w:tcMar>
+              <w:top w:w="92" w:type="dxa"/>
+              <w:bottom w:w="92" w:type="dxa"/>
+            </w:tcMar>
+          </w:tcPr>
+          <w:p>
+            <w:pPr>
+              <w:pStyle w:val="FirstParagraph"/>
+            </w:pPr>
+            <w:pPr>
+              <w:spacing w:before="0" w:after="0"/>
+              <w:textAlignment w:val="center"/>
+            </w:pPr>
+            <w:r>
+              <w:drawing>
+                <wp:inline>
+                  <wp:extent cx="152400" cy="152400"/>
+                  <wp:effectExtent b="0" l="0" r="0" t="0"/>
+                  <wp:docPr descr="" title="" id="35" name="Picture"/>
+                  <a:graphic>
+                    <a:graphicData uri="http://schemas.openxmlformats.org/drawingml/2006/picture">
+                      <pic:pic>
+                        <pic:nvPicPr>
+                          <pic:cNvPr descr="/opt/quarto/share/formats/docx/tip.png" id="36" name="Picture"/>
+                          <pic:cNvPicPr>
+                            <a:picLocks noChangeArrowheads="1" noChangeAspect="1"/>
+                          </pic:cNvPicPr>
+                        </pic:nvPicPr>
+                        <pic:blipFill>
+                          <a:blip r:embed="rId34"/>
+                          <a:stretch>
+                            <a:fillRect/>
+                          </a:stretch>
+                        </pic:blipFill>
+                        <pic:spPr bwMode="auto">
+                          <a:xfrm>
+                            <a:off x="0" y="0"/>
+                            <a:ext cx="152400" cy="152400"/>
+                          </a:xfrm>
+                          <a:prstGeom prst="rect">
+                            <a:avLst/>
+                          </a:prstGeom>
+                          <a:noFill/>
+                          <a:ln w="9525">
+                            <a:noFill/>
+                            <a:headEnd/>
+                            <a:tailEnd/>
+                          </a:ln>
+                        </pic:spPr>
+                      </pic:pic>
+                    </a:graphicData>
+                  </a:graphic>
+                </wp:inline>
+              </w:drawing>
+            </w:r>
+            <w:r>
+              <w:t xml:space="preserve"> </w:t>
+            </w:r>
+            <w:r>
+              <w:t xml:space="preserve"> </w:t>
+            </w:r>
+            <w:r>
+              <w:t xml:space="preserve">Video lecture</w:t>
+            </w:r>
+          </w:p>
+        </w:tc>
+      </w:tr>
+      <w:tr>
+        <w:trPr>
+          <w:cantSplit/>
+        </w:trPr>
+        <w:tc>
+          <w:tcPr>
+            <w:tcMar>
+              <w:top w:w="108" w:type="dxa"/>
+              <w:bottom w:w="108" w:type="dxa"/>
+            </w:tcMar>
+          </w:tcPr>
+          <w:p>
+            <w:pPr>
+              <w:pStyle w:val="BodyText"/>
+            </w:pPr>
+            <w:pPr>
+              <w:spacing w:before="16" w:after="16"/>
+            </w:pPr>
+            <w:r>
+              <w:t xml:space="preserve">Richard McElreath’s</w:t>
+            </w:r>
+            <w:r>
+              <w:t xml:space="preserve"> </w:t>
+            </w:r>
+            <w:hyperlink r:id="rId37">
+              <w:r>
+                <w:rPr>
+                  <w:rStyle w:val="Hyperlink"/>
+                  <w:i/>
+                  <w:iCs/>
+                </w:rPr>
+                <w:t xml:space="preserve">Elemental Confounds I</w:t>
+              </w:r>
+            </w:hyperlink>
+            <w:r>
+              <w:t xml:space="preserve"> </w:t>
+            </w:r>
+            <w:r>
+              <w:t xml:space="preserve">(Statistical Rethinking 2026, Lecture A06)</w:t>
+            </w:r>
+            <w:r>
+              <w:t xml:space="preserve"> </w:t>
+            </w:r>
+            <w:r>
+              <w:t xml:space="preserve">accompanies Chapter 6 of</w:t>
+            </w:r>
+            <w:r>
+              <w:t xml:space="preserve"> </w:t>
+            </w:r>
+            <w:r>
+              <w:t xml:space="preserve">McElreath (2020)</w:t>
+            </w:r>
+            <w:r>
+              <w:t xml:space="preserve">,</w:t>
+            </w:r>
+            <w:r>
+              <w:t xml:space="preserve"> </w:t>
+            </w:r>
+            <w:r>
+              <w:t xml:space="preserve">which uses directed acyclic graphs (DAGs) to describe confounding</w:t>
+            </w:r>
+            <w:r>
+              <w:t xml:space="preserve"> </w:t>
+            </w:r>
+            <w:r>
+              <w:t xml:space="preserve">(McElreath 2026)</w:t>
+            </w:r>
+            <w:r>
+              <w:t xml:space="preserve">.</w:t>
+            </w:r>
+          </w:p>
+          <w:p/>
+        </w:tc>
+      </w:tr>
+    </w:tbl>
     <w:p>
       <w:pPr>
-        <w:pStyle w:val="FirstParagraph"/>
+        <w:pStyle w:val="BodyText"/>
       </w:pPr>
       <w:r>
         <w:t xml:space="preserve">In an</w:t>
@@ -8769,7 +8934,7 @@
         <w:t xml:space="preserve">.</w:t>
       </w:r>
     </w:p>
-    <w:bookmarkStart w:id="35" w:name="sec-causal-confounding"/>
+    <w:bookmarkStart w:id="39" w:name="sec-causal-confounding"/>
     <w:p>
       <w:pPr>
         <w:pStyle w:val="Heading2"/>
@@ -8812,7 +8977,7 @@
               <w:spacing w:before="16" w:after="64"/>
             </w:pPr>
           </w:p>
-          <w:bookmarkStart w:id="34" w:name="def-confounding-obs"/>
+          <w:bookmarkStart w:id="38" w:name="def-confounding-obs"/>
           <w:p>
             <w:pPr>
               <w:pStyle w:val="BodyText"/>
@@ -9069,7 +9234,7 @@
               <w:t xml:space="preserve">.</w:t>
             </w:r>
           </w:p>
-          <w:bookmarkEnd w:id="34"/>
+          <w:bookmarkEnd w:id="38"/>
         </w:tc>
       </w:tr>
     </w:tbl>
@@ -9105,8 +9270,8 @@
         <w:t xml:space="preserve">and sufficient adjustment sets.</w:t>
       </w:r>
     </w:p>
-    <w:bookmarkEnd w:id="35"/>
-    <w:bookmarkStart w:id="36" w:name="sec-pred-sel-dag"/>
+    <w:bookmarkEnd w:id="39"/>
+    <w:bookmarkStart w:id="40" w:name="sec-pred-sel-dag"/>
     <w:p>
       <w:pPr>
         <w:pStyle w:val="Heading2"/>
@@ -9364,8 +9529,8 @@
         <w:t xml:space="preserve">(adjusting for a collider opens a non-causal path).</w:t>
       </w:r>
     </w:p>
-    <w:bookmarkEnd w:id="36"/>
-    <w:bookmarkStart w:id="41" w:name="sec-pred-sel-dag-concepts"/>
+    <w:bookmarkEnd w:id="40"/>
+    <w:bookmarkStart w:id="45" w:name="sec-pred-sel-dag-concepts"/>
     <w:p>
       <w:pPr>
         <w:pStyle w:val="Heading2"/>
@@ -9408,7 +9573,7 @@
               <w:spacing w:before="16" w:after="64"/>
             </w:pPr>
           </w:p>
-          <w:bookmarkStart w:id="37" w:name="def-confounder"/>
+          <w:bookmarkStart w:id="41" w:name="def-confounder"/>
           <w:p>
             <w:pPr>
               <w:pStyle w:val="BodyText"/>
@@ -9595,7 +9760,7 @@
               <w:t xml:space="preserve">Adjusting for confounders removes confounding bias.</w:t>
             </w:r>
           </w:p>
-          <w:bookmarkEnd w:id="37"/>
+          <w:bookmarkEnd w:id="41"/>
         </w:tc>
       </w:tr>
     </w:tbl>
@@ -9640,7 +9805,7 @@
               <w:spacing w:before="16" w:after="64"/>
             </w:pPr>
           </w:p>
-          <w:bookmarkStart w:id="38" w:name="def-mediator"/>
+          <w:bookmarkStart w:id="42" w:name="def-mediator"/>
           <w:p>
             <w:pPr>
               <w:pStyle w:val="BodyText"/>
@@ -10031,7 +10196,7 @@
               <w:t xml:space="preserve">.</w:t>
             </w:r>
           </w:p>
-          <w:bookmarkEnd w:id="38"/>
+          <w:bookmarkEnd w:id="42"/>
         </w:tc>
       </w:tr>
     </w:tbl>
@@ -10076,7 +10241,7 @@
               <w:spacing w:before="16" w:after="64"/>
             </w:pPr>
           </w:p>
-          <w:bookmarkStart w:id="39" w:name="def-collider"/>
+          <w:bookmarkStart w:id="43" w:name="def-collider"/>
           <w:p>
             <w:pPr>
               <w:pStyle w:val="BodyText"/>
@@ -10222,7 +10387,7 @@
               <w:t xml:space="preserve">.</w:t>
             </w:r>
           </w:p>
-          <w:bookmarkEnd w:id="39"/>
+          <w:bookmarkEnd w:id="43"/>
         </w:tc>
       </w:tr>
     </w:tbl>
@@ -10267,7 +10432,7 @@
               <w:spacing w:before="16" w:after="64"/>
             </w:pPr>
           </w:p>
-          <w:bookmarkStart w:id="40" w:name="def-backdoor-criterion"/>
+          <w:bookmarkStart w:id="44" w:name="def-backdoor-criterion"/>
           <w:p>
             <w:pPr>
               <w:pStyle w:val="BodyText"/>
@@ -10772,12 +10937,12 @@
               </m:oMath>
             </m:oMathPara>
           </w:p>
-          <w:bookmarkEnd w:id="40"/>
+          <w:bookmarkEnd w:id="44"/>
         </w:tc>
       </w:tr>
     </w:tbl>
-    <w:bookmarkEnd w:id="41"/>
-    <w:bookmarkStart w:id="47" w:name="sec-pred-sel-hers-dag"/>
+    <w:bookmarkEnd w:id="45"/>
+    <w:bookmarkStart w:id="51" w:name="sec-pred-sel-hers-dag"/>
     <w:p>
       <w:pPr>
         <w:pStyle w:val="Heading2"/>
@@ -10975,7 +11140,7 @@
       <w:tr>
         <w:tc>
           <w:tcPr/>
-          <w:bookmarkStart w:id="42" w:name="tbl-hers-data-dictionary"/>
+          <w:bookmarkStart w:id="46" w:name="tbl-hers-data-dictionary"/>
           <w:p>
             <w:pPr>
               <w:jc w:val="center"/>
@@ -11461,7 +11626,7 @@
               </w:tc>
             </w:tr>
           </w:tbl>
-          <w:bookmarkEnd w:id="42"/>
+          <w:bookmarkEnd w:id="46"/>
           <w:p/>
         </w:tc>
       </w:tr>
@@ -11487,7 +11652,7 @@
       <w:tr>
         <w:tc>
           <w:tcPr/>
-          <w:bookmarkStart w:id="46" w:name="fig-hers-dag"/>
+          <w:bookmarkStart w:id="50" w:name="fig-hers-dag"/>
           <w:p>
             <w:pPr>
               <w:pStyle w:val="SourceCode"/>
@@ -11839,18 +12004,18 @@
                 <wp:inline>
                   <wp:extent cx="5334000" cy="3809999"/>
                   <wp:effectExtent b="0" l="0" r="0" t="0"/>
-                  <wp:docPr descr="" title="" id="44" name="Picture"/>
+                  <wp:docPr descr="" title="" id="48" name="Picture"/>
                   <a:graphic>
                     <a:graphicData uri="http://schemas.openxmlformats.org/drawingml/2006/picture">
                       <pic:pic>
                         <pic:nvPicPr>
-                          <pic:cNvPr descr="causal-inference_files/figure-docx/unnamed-chunk-1-1.png" id="45" name="Picture"/>
+                          <pic:cNvPr descr="causal-inference_files/figure-docx/unnamed-chunk-1-1.png" id="49" name="Picture"/>
                           <pic:cNvPicPr>
                             <a:picLocks noChangeArrowheads="1" noChangeAspect="1"/>
                           </pic:cNvPicPr>
                         </pic:nvPicPr>
                         <pic:blipFill>
-                          <a:blip r:embed="rId43"/>
+                          <a:blip r:embed="rId47"/>
                           <a:stretch>
                             <a:fillRect/>
                           </a:stretch>
@@ -11965,7 +12130,7 @@
               <w:t xml:space="preserve">= systolic blood pressure.</w:t>
             </w:r>
           </w:p>
-          <w:bookmarkEnd w:id="46"/>
+          <w:bookmarkEnd w:id="50"/>
         </w:tc>
       </w:tr>
     </w:tbl>
@@ -12173,8 +12338,8 @@
         <w:t xml:space="preserve">additional variables such as anti-hypertensive medication use.</w:t>
       </w:r>
     </w:p>
-    <w:bookmarkEnd w:id="47"/>
-    <w:bookmarkStart w:id="49" w:name="sec-pred-sel-hers-adjust"/>
+    <w:bookmarkEnd w:id="51"/>
+    <w:bookmarkStart w:id="53" w:name="sec-pred-sel-hers-adjust"/>
     <w:p>
       <w:pPr>
         <w:pStyle w:val="Heading2"/>
@@ -12216,7 +12381,7 @@
       <w:tr>
         <w:tc>
           <w:tcPr/>
-          <w:bookmarkStart w:id="48" w:name="tbl-hers-adj"/>
+          <w:bookmarkStart w:id="52" w:name="tbl-hers-adj"/>
           <w:p>
             <w:pPr>
               <w:jc w:val="center"/>
@@ -12368,7 +12533,7 @@
               <w:t xml:space="preserve">#&gt;  {}</w:t>
             </w:r>
           </w:p>
-          <w:bookmarkEnd w:id="48"/>
+          <w:bookmarkEnd w:id="52"/>
         </w:tc>
       </w:tr>
     </w:tbl>
@@ -12573,8 +12738,8 @@
         <w:t xml:space="preserve">(not through lipids).</w:t>
       </w:r>
     </w:p>
-    <w:bookmarkEnd w:id="49"/>
-    <w:bookmarkStart w:id="55" w:name="sec-pred-sel-hers-ldl"/>
+    <w:bookmarkEnd w:id="53"/>
+    <w:bookmarkStart w:id="59" w:name="sec-pred-sel-hers-ldl"/>
     <w:p>
       <w:pPr>
         <w:pStyle w:val="Heading2"/>
@@ -13331,7 +13496,7 @@
       <w:tr>
         <w:tc>
           <w:tcPr/>
-          <w:bookmarkStart w:id="50" w:name="tbl-hers-ldl-full"/>
+          <w:bookmarkStart w:id="54" w:name="tbl-hers-ldl-full"/>
           <w:p>
             <w:pPr>
               <w:jc w:val="center"/>
@@ -14452,11 +14617,11 @@
               </w:tc>
             </w:tr>
           </w:tbl>
-          <w:bookmarkEnd w:id="50"/>
+          <w:bookmarkEnd w:id="54"/>
         </w:tc>
       </w:tr>
     </w:tbl>
-    <w:bookmarkStart w:id="52" w:name="unadjusted-model"/>
+    <w:bookmarkStart w:id="56" w:name="unadjusted-model"/>
     <w:p>
       <w:pPr>
         <w:pStyle w:val="Heading3"/>
@@ -14478,7 +14643,7 @@
       <w:tr>
         <w:tc>
           <w:tcPr/>
-          <w:bookmarkStart w:id="51" w:name="tbl-hers-ldl-unadj"/>
+          <w:bookmarkStart w:id="55" w:name="tbl-hers-ldl-unadj"/>
           <w:p>
             <w:pPr>
               <w:jc w:val="center"/>
@@ -15064,12 +15229,12 @@
               </w:tc>
             </w:tr>
           </w:tbl>
-          <w:bookmarkEnd w:id="51"/>
+          <w:bookmarkEnd w:id="55"/>
         </w:tc>
       </w:tr>
     </w:tbl>
-    <w:bookmarkEnd w:id="52"/>
-    <w:bookmarkStart w:id="54" w:name="adjusted-model"/>
+    <w:bookmarkEnd w:id="56"/>
+    <w:bookmarkStart w:id="58" w:name="adjusted-model"/>
     <w:p>
       <w:pPr>
         <w:pStyle w:val="Heading3"/>
@@ -15163,7 +15328,7 @@
       <w:tr>
         <w:tc>
           <w:tcPr/>
-          <w:bookmarkStart w:id="53" w:name="tbl-hers-ldl-adj"/>
+          <w:bookmarkStart w:id="57" w:name="tbl-hers-ldl-adj"/>
           <w:p>
             <w:pPr>
               <w:jc w:val="center"/>
@@ -16609,7 +16774,7 @@
               </w:tc>
             </w:tr>
           </w:tbl>
-          <w:bookmarkEnd w:id="53"/>
+          <w:bookmarkEnd w:id="57"/>
         </w:tc>
       </w:tr>
     </w:tbl>
@@ -16669,9 +16834,9 @@
         <w:t xml:space="preserve">improving precision of the HT coefficient.</w:t>
       </w:r>
     </w:p>
-    <w:bookmarkEnd w:id="54"/>
-    <w:bookmarkEnd w:id="55"/>
-    <w:bookmarkStart w:id="61" w:name="sec-pred-sel-wcgs-dag"/>
+    <w:bookmarkEnd w:id="58"/>
+    <w:bookmarkEnd w:id="59"/>
+    <w:bookmarkStart w:id="65" w:name="sec-pred-sel-wcgs-dag"/>
     <w:p>
       <w:pPr>
         <w:pStyle w:val="Heading2"/>
@@ -16801,7 +16966,7 @@
       <w:tr>
         <w:tc>
           <w:tcPr/>
-          <w:bookmarkStart w:id="56" w:name="tbl-wcgs-data-dictionary"/>
+          <w:bookmarkStart w:id="60" w:name="tbl-wcgs-data-dictionary"/>
           <w:p>
             <w:pPr>
               <w:jc w:val="center"/>
@@ -17164,7 +17329,7 @@
               </w:tc>
             </w:tr>
           </w:tbl>
-          <w:bookmarkEnd w:id="56"/>
+          <w:bookmarkEnd w:id="60"/>
           <w:p/>
         </w:tc>
       </w:tr>
@@ -17190,7 +17355,7 @@
       <w:tr>
         <w:tc>
           <w:tcPr/>
-          <w:bookmarkStart w:id="60" w:name="fig-wcgs-dag"/>
+          <w:bookmarkStart w:id="64" w:name="fig-wcgs-dag"/>
           <w:p>
             <w:pPr>
               <w:pStyle w:val="SourceCode"/>
@@ -17470,18 +17635,18 @@
                 <wp:inline>
                   <wp:extent cx="5334000" cy="3809999"/>
                   <wp:effectExtent b="0" l="0" r="0" t="0"/>
-                  <wp:docPr descr="" title="" id="58" name="Picture"/>
+                  <wp:docPr descr="" title="" id="62" name="Picture"/>
                   <a:graphic>
                     <a:graphicData uri="http://schemas.openxmlformats.org/drawingml/2006/picture">
                       <pic:pic>
                         <pic:nvPicPr>
-                          <pic:cNvPr descr="causal-inference_files/figure-docx/unnamed-chunk-5-1.png" id="59" name="Picture"/>
+                          <pic:cNvPr descr="causal-inference_files/figure-docx/unnamed-chunk-5-1.png" id="63" name="Picture"/>
                           <pic:cNvPicPr>
                             <a:picLocks noChangeArrowheads="1" noChangeAspect="1"/>
                           </pic:cNvPicPr>
                         </pic:nvPicPr>
                         <pic:blipFill>
-                          <a:blip r:embed="rId57"/>
+                          <a:blip r:embed="rId61"/>
                           <a:stretch>
                             <a:fillRect/>
                           </a:stretch>
@@ -17581,7 +17746,7 @@
               <w:t xml:space="preserve">= systolic blood pressure.</w:t>
             </w:r>
           </w:p>
-          <w:bookmarkEnd w:id="60"/>
+          <w:bookmarkEnd w:id="64"/>
         </w:tc>
       </w:tr>
     </w:tbl>
@@ -18050,9 +18215,9 @@
         <w:t xml:space="preserve">(under the assumptions encoded in the DAG).</w:t>
       </w:r>
     </w:p>
-    <w:bookmarkEnd w:id="61"/>
-    <w:bookmarkEnd w:id="62"/>
-    <w:bookmarkStart w:id="67" w:name="sec-causal-regression"/>
+    <w:bookmarkEnd w:id="65"/>
+    <w:bookmarkEnd w:id="66"/>
+    <w:bookmarkStart w:id="74" w:name="sec-causal-regression"/>
     <w:p>
       <w:pPr>
         <w:pStyle w:val="Heading1"/>
@@ -18061,9 +18226,180 @@
         <w:t xml:space="preserve">7. Regression Adjustment</w:t>
       </w:r>
     </w:p>
+    <w:tbl>
+      <w:tblPr>
+        <w:tblStyle w:val="Table"/>
+        <w:tblLook w:firstRow="0" w:lastRow="0" w:firstColumn="0" w:lastColumn="0" w:noHBand="0" w:noVBand="0" w:val="0000"/>
+        <w:tblBorders>
+          <w:top w:val="single" w:sz="4" w:space="0" w:color="00A047"/>
+          <w:left w:val="single" w:sz="24" w:space="0" w:color="00A047"/>
+          <w:bottom w:val="single" w:sz="4" w:space="0" w:color="00A047"/>
+          <w:right w:val="single" w:sz="4" w:space="0" w:color="00A047"/>
+        </w:tblBorders>
+        <w:tblCellMar>
+          <w:left w:w="144" w:type="dxa"/>
+          <w:right w:w="144" w:type="dxa"/>
+        </w:tblCellMar>
+        <w:tblLook w:firstRow="0" w:lastRow="0" w:firstColumn="0" w:lastColumn="0" w:noHBand="0" w:noVBand="0" w:val="0000"/>
+      </w:tblPr>
+      <w:tr>
+        <w:trPr>
+          <w:cantSplit/>
+        </w:trPr>
+        <w:tc>
+          <w:tcPr>
+            <w:shd w:color="auto" w:fill="ccf1e3" w:val="clear"/>
+            <w:tcMar>
+              <w:top w:w="92" w:type="dxa"/>
+              <w:bottom w:w="92" w:type="dxa"/>
+            </w:tcMar>
+          </w:tcPr>
+          <w:p>
+            <w:pPr>
+              <w:pStyle w:val="FirstParagraph"/>
+            </w:pPr>
+            <w:pPr>
+              <w:spacing w:before="0" w:after="0"/>
+              <w:textAlignment w:val="center"/>
+            </w:pPr>
+            <w:r>
+              <w:drawing>
+                <wp:inline>
+                  <wp:extent cx="152400" cy="152400"/>
+                  <wp:effectExtent b="0" l="0" r="0" t="0"/>
+                  <wp:docPr descr="" title="" id="67" name="Picture"/>
+                  <a:graphic>
+                    <a:graphicData uri="http://schemas.openxmlformats.org/drawingml/2006/picture">
+                      <pic:pic>
+                        <pic:nvPicPr>
+                          <pic:cNvPr descr="/opt/quarto/share/formats/docx/tip.png" id="68" name="Picture"/>
+                          <pic:cNvPicPr>
+                            <a:picLocks noChangeArrowheads="1" noChangeAspect="1"/>
+                          </pic:cNvPicPr>
+                        </pic:nvPicPr>
+                        <pic:blipFill>
+                          <a:blip r:embed="rId34"/>
+                          <a:stretch>
+                            <a:fillRect/>
+                          </a:stretch>
+                        </pic:blipFill>
+                        <pic:spPr bwMode="auto">
+                          <a:xfrm>
+                            <a:off x="0" y="0"/>
+                            <a:ext cx="152400" cy="152400"/>
+                          </a:xfrm>
+                          <a:prstGeom prst="rect">
+                            <a:avLst/>
+                          </a:prstGeom>
+                          <a:noFill/>
+                          <a:ln w="9525">
+                            <a:noFill/>
+                            <a:headEnd/>
+                            <a:tailEnd/>
+                          </a:ln>
+                        </pic:spPr>
+                      </pic:pic>
+                    </a:graphicData>
+                  </a:graphic>
+                </wp:inline>
+              </w:drawing>
+            </w:r>
+            <w:r>
+              <w:t xml:space="preserve"> </w:t>
+            </w:r>
+            <w:r>
+              <w:t xml:space="preserve"> </w:t>
+            </w:r>
+            <w:r>
+              <w:t xml:space="preserve">Video lecture</w:t>
+            </w:r>
+          </w:p>
+        </w:tc>
+      </w:tr>
+      <w:tr>
+        <w:trPr>
+          <w:cantSplit/>
+        </w:trPr>
+        <w:tc>
+          <w:tcPr>
+            <w:tcMar>
+              <w:top w:w="108" w:type="dxa"/>
+              <w:bottom w:w="108" w:type="dxa"/>
+            </w:tcMar>
+          </w:tcPr>
+          <w:p>
+            <w:pPr>
+              <w:pStyle w:val="BodyText"/>
+            </w:pPr>
+            <w:pPr>
+              <w:spacing w:before="16" w:after="16"/>
+            </w:pPr>
+            <w:r>
+              <w:t xml:space="preserve">Richard McElreath’s</w:t>
+            </w:r>
+            <w:r>
+              <w:t xml:space="preserve"> </w:t>
+            </w:r>
+            <w:hyperlink r:id="rId69">
+              <w:r>
+                <w:rPr>
+                  <w:rStyle w:val="Hyperlink"/>
+                  <w:i/>
+                  <w:iCs/>
+                </w:rPr>
+                <w:t xml:space="preserve">Good and Bad Controls</w:t>
+              </w:r>
+            </w:hyperlink>
+            <w:r>
+              <w:t xml:space="preserve"> </w:t>
+            </w:r>
+            <w:r>
+              <w:t xml:space="preserve">(Statistical Rethinking 2026, Lecture A07)</w:t>
+            </w:r>
+            <w:r>
+              <w:t xml:space="preserve"> </w:t>
+            </w:r>
+            <w:r>
+              <w:t xml:space="preserve">also accompanies Chapter 6 of</w:t>
+            </w:r>
+            <w:r>
+              <w:t xml:space="preserve"> </w:t>
+            </w:r>
+            <w:r>
+              <w:t xml:space="preserve">McElreath (2020)</w:t>
+            </w:r>
+            <w:r>
+              <w:t xml:space="preserve">,</w:t>
+            </w:r>
+            <w:r>
+              <w:t xml:space="preserve"> </w:t>
+            </w:r>
+            <w:r>
+              <w:t xml:space="preserve">and discusses which covariates a regression model should</w:t>
+            </w:r>
+            <w:r>
+              <w:t xml:space="preserve"> </w:t>
+            </w:r>
+            <w:r>
+              <w:t xml:space="preserve">and should not adjust for</w:t>
+            </w:r>
+            <w:r>
+              <w:t xml:space="preserve"> </w:t>
+            </w:r>
+            <w:r>
+              <w:t xml:space="preserve">(McElreath 2026)</w:t>
+            </w:r>
+            <w:r>
+              <w:t xml:space="preserve">.</w:t>
+            </w:r>
+          </w:p>
+          <w:p/>
+        </w:tc>
+      </w:tr>
+    </w:tbl>
     <w:p>
       <w:pPr>
-        <w:pStyle w:val="FirstParagraph"/>
+        <w:pStyle w:val="BodyText"/>
       </w:pPr>
       <w:r>
         <w:t xml:space="preserve">Under the causal assumptions</w:t>
@@ -18108,7 +18444,7 @@
         <w:t xml:space="preserve">in a regression model.</w:t>
       </w:r>
     </w:p>
-    <w:bookmarkStart w:id="63" w:name="sec-causal-g-computation"/>
+    <w:bookmarkStart w:id="70" w:name="sec-causal-g-computation"/>
     <w:p>
       <w:pPr>
         <w:pStyle w:val="Heading2"/>
@@ -18908,8 +19244,8 @@
         <w:t xml:space="preserve">Multiple treatments or treatment levels</w:t>
       </w:r>
     </w:p>
-    <w:bookmarkEnd w:id="63"/>
-    <w:bookmarkStart w:id="64" w:name="sec-causal-linear-adjustment"/>
+    <w:bookmarkEnd w:id="70"/>
+    <w:bookmarkStart w:id="71" w:name="sec-causal-linear-adjustment"/>
     <w:p>
       <w:pPr>
         <w:pStyle w:val="Heading2"/>
@@ -20353,8 +20689,8 @@
         <w:t xml:space="preserve">G-computation is preferred in that case.</w:t>
       </w:r>
     </w:p>
-    <w:bookmarkEnd w:id="64"/>
-    <w:bookmarkStart w:id="66" w:name="sec-causal-hers-ldl-adj"/>
+    <w:bookmarkEnd w:id="71"/>
+    <w:bookmarkStart w:id="73" w:name="sec-causal-hers-ldl-adj"/>
     <w:p>
       <w:pPr>
         <w:pStyle w:val="Heading2"/>
@@ -21149,7 +21485,7 @@
       <w:tr>
         <w:tc>
           <w:tcPr/>
-          <w:bookmarkStart w:id="65" w:name="tbl-causal-hers-ldl-adj"/>
+          <w:bookmarkStart w:id="72" w:name="tbl-causal-hers-ldl-adj"/>
           <w:p>
             <w:pPr>
               <w:jc w:val="center"/>
@@ -22616,7 +22952,7 @@
               </w:tc>
             </w:tr>
           </w:tbl>
-          <w:bookmarkEnd w:id="65"/>
+          <w:bookmarkEnd w:id="72"/>
         </w:tc>
       </w:tr>
     </w:tbl>
@@ -22640,9 +22976,9 @@
         <w:t xml:space="preserve">with narrower confidence intervals than the unadjusted estimate.</w:t>
       </w:r>
     </w:p>
-    <w:bookmarkEnd w:id="66"/>
-    <w:bookmarkEnd w:id="67"/>
-    <w:bookmarkStart w:id="78" w:name="sec-causal-propensity"/>
+    <w:bookmarkEnd w:id="73"/>
+    <w:bookmarkEnd w:id="74"/>
+    <w:bookmarkStart w:id="85" w:name="sec-causal-propensity"/>
     <w:p>
       <w:pPr>
         <w:pStyle w:val="Heading1"/>
@@ -22742,7 +23078,7 @@
               <w:spacing w:before="16" w:after="64"/>
             </w:pPr>
           </w:p>
-          <w:bookmarkStart w:id="68" w:name="def-propensity-score"/>
+          <w:bookmarkStart w:id="75" w:name="def-propensity-score"/>
           <w:p>
             <w:pPr>
               <w:pStyle w:val="BodyText"/>
@@ -23192,11 +23528,11 @@
               <w:t xml:space="preserve">to remove confounding.</w:t>
             </w:r>
           </w:p>
-          <w:bookmarkEnd w:id="68"/>
+          <w:bookmarkEnd w:id="75"/>
         </w:tc>
       </w:tr>
     </w:tbl>
-    <w:bookmarkStart w:id="69" w:name="sec-ps-estimation"/>
+    <w:bookmarkStart w:id="76" w:name="sec-ps-estimation"/>
     <w:p>
       <w:pPr>
         <w:pStyle w:val="Heading2"/>
@@ -23474,8 +23810,8 @@
         <w:t xml:space="preserve">is the predicted probability of treatment for each individual.</w:t>
       </w:r>
     </w:p>
-    <w:bookmarkEnd w:id="69"/>
-    <w:bookmarkStart w:id="71" w:name="sec-ps-methods"/>
+    <w:bookmarkEnd w:id="76"/>
+    <w:bookmarkStart w:id="78" w:name="sec-ps-methods"/>
     <w:p>
       <w:pPr>
         <w:pStyle w:val="Heading2"/>
@@ -23672,7 +24008,7 @@
               <w:spacing w:before="16" w:after="64"/>
             </w:pPr>
           </w:p>
-          <w:bookmarkStart w:id="70" w:name="def-ipw"/>
+          <w:bookmarkStart w:id="77" w:name="def-ipw"/>
           <w:p>
             <w:pPr>
               <w:pStyle w:val="BodyText"/>
@@ -24246,12 +24582,12 @@
               <w:t xml:space="preserve">effectively removing confounding.</w:t>
             </w:r>
           </w:p>
-          <w:bookmarkEnd w:id="70"/>
+          <w:bookmarkEnd w:id="77"/>
         </w:tc>
       </w:tr>
     </w:tbl>
-    <w:bookmarkEnd w:id="71"/>
-    <w:bookmarkStart w:id="77" w:name="sec-ps-wcgs"/>
+    <w:bookmarkEnd w:id="78"/>
+    <w:bookmarkStart w:id="84" w:name="sec-ps-wcgs"/>
     <w:p>
       <w:pPr>
         <w:pStyle w:val="Heading2"/>
@@ -25187,7 +25523,7 @@
       <w:tr>
         <w:tc>
           <w:tcPr/>
-          <w:bookmarkStart w:id="75" w:name="fig-ps-wcgs"/>
+          <w:bookmarkStart w:id="82" w:name="fig-ps-wcgs"/>
           <w:p>
             <w:pPr>
               <w:pStyle w:val="SourceCode"/>
@@ -25713,18 +26049,18 @@
                 <wp:inline>
                   <wp:extent cx="4620126" cy="3696101"/>
                   <wp:effectExtent b="0" l="0" r="0" t="0"/>
-                  <wp:docPr descr="" title="" id="73" name="Picture"/>
+                  <wp:docPr descr="" title="" id="80" name="Picture"/>
                   <a:graphic>
                     <a:graphicData uri="http://schemas.openxmlformats.org/drawingml/2006/picture">
                       <pic:pic>
                         <pic:nvPicPr>
-                          <pic:cNvPr descr="causal-inference_files/figure-docx/unnamed-chunk-7-1.png" id="74" name="Picture"/>
+                          <pic:cNvPr descr="causal-inference_files/figure-docx/unnamed-chunk-7-1.png" id="81" name="Picture"/>
                           <pic:cNvPicPr>
                             <a:picLocks noChangeArrowheads="1" noChangeAspect="1"/>
                           </pic:cNvPicPr>
                         </pic:nvPicPr>
                         <pic:blipFill>
-                          <a:blip r:embed="rId72"/>
+                          <a:blip r:embed="rId79"/>
                           <a:stretch>
                             <a:fillRect/>
                           </a:stretch>
@@ -25820,7 +26156,7 @@
               <w:t xml:space="preserve">supports positivity.</w:t>
             </w:r>
           </w:p>
-          <w:bookmarkEnd w:id="75"/>
+          <w:bookmarkEnd w:id="82"/>
         </w:tc>
       </w:tr>
     </w:tbl>
@@ -25845,7 +26181,7 @@
       <w:tr>
         <w:tc>
           <w:tcPr/>
-          <w:bookmarkStart w:id="76" w:name="tbl-ps-wcgs-ipw"/>
+          <w:bookmarkStart w:id="83" w:name="tbl-ps-wcgs-ipw"/>
           <w:p>
             <w:pPr>
               <w:jc w:val="center"/>
@@ -26346,7 +26682,7 @@
               </w:tc>
             </w:tr>
           </w:tbl>
-          <w:bookmarkEnd w:id="76"/>
+          <w:bookmarkEnd w:id="83"/>
         </w:tc>
       </w:tr>
     </w:tbl>
@@ -26390,9 +26726,9 @@
         <w:t xml:space="preserve">in the WCGS data.</w:t>
       </w:r>
     </w:p>
-    <w:bookmarkEnd w:id="77"/>
-    <w:bookmarkEnd w:id="78"/>
-    <w:bookmarkStart w:id="79" w:name="sec-causal-summary"/>
+    <w:bookmarkEnd w:id="84"/>
+    <w:bookmarkEnd w:id="85"/>
+    <w:bookmarkStart w:id="86" w:name="sec-causal-summary"/>
     <w:p>
       <w:pPr>
         <w:pStyle w:val="Heading1"/>
@@ -26673,8 +27009,8 @@
         <w:t xml:space="preserve">can recover causal estimates under these three core identification assumptions.</w:t>
       </w:r>
     </w:p>
-    <w:bookmarkEnd w:id="79"/>
-    <w:bookmarkStart w:id="80" w:name="sec-causal-objectives"/>
+    <w:bookmarkEnd w:id="86"/>
+    <w:bookmarkStart w:id="87" w:name="sec-causal-objectives"/>
     <w:p>
       <w:pPr>
         <w:pStyle w:val="Heading1"/>
@@ -26912,8 +27248,8 @@
         <w:t xml:space="preserve">and articulate the additional assumptions required in each setting.</w:t>
       </w:r>
     </w:p>
-    <w:bookmarkEnd w:id="80"/>
-    <w:bookmarkStart w:id="95" w:name="references"/>
+    <w:bookmarkEnd w:id="87"/>
+    <w:bookmarkStart w:id="105" w:name="references"/>
     <w:p>
       <w:pPr>
         <w:pStyle w:val="Heading1"/>
@@ -26922,8 +27258,8 @@
         <w:t xml:space="preserve">References</w:t>
       </w:r>
     </w:p>
-    <w:bookmarkStart w:id="94" w:name="refs"/>
-    <w:bookmarkStart w:id="82" w:name="ref-hernan2020causal"/>
+    <w:bookmarkStart w:id="104" w:name="refs"/>
+    <w:bookmarkStart w:id="89" w:name="ref-hernan2020causal"/>
     <w:p>
       <w:pPr>
         <w:pStyle w:val="Bibliography"/>
@@ -26947,7 +27283,7 @@
       <w:r>
         <w:t xml:space="preserve"> </w:t>
       </w:r>
-      <w:hyperlink r:id="rId81">
+      <w:hyperlink r:id="rId88">
         <w:r>
           <w:rPr>
             <w:rStyle w:val="Hyperlink"/>
@@ -26959,8 +27295,8 @@
         <w:t xml:space="preserve">.</w:t>
       </w:r>
     </w:p>
-    <w:bookmarkEnd w:id="82"/>
-    <w:bookmarkStart w:id="84" w:name="ref-holland1986statistics"/>
+    <w:bookmarkEnd w:id="89"/>
+    <w:bookmarkStart w:id="91" w:name="ref-holland1986statistics"/>
     <w:p>
       <w:pPr>
         <w:pStyle w:val="Bibliography"/>
@@ -26993,7 +27329,7 @@
       <w:r>
         <w:t xml:space="preserve"> </w:t>
       </w:r>
-      <w:hyperlink r:id="rId83">
+      <w:hyperlink r:id="rId90">
         <w:r>
           <w:rPr>
             <w:rStyle w:val="Hyperlink"/>
@@ -27005,8 +27341,8 @@
         <w:t xml:space="preserve">.</w:t>
       </w:r>
     </w:p>
-    <w:bookmarkEnd w:id="84"/>
-    <w:bookmarkStart w:id="85" w:name="ref-HulleyStephen1998RToE"/>
+    <w:bookmarkEnd w:id="91"/>
+    <w:bookmarkStart w:id="92" w:name="ref-HulleyStephen1998RToE"/>
     <w:p>
       <w:pPr>
         <w:pStyle w:val="Bibliography"/>
@@ -27037,20 +27373,14 @@
         <w:t xml:space="preserve">(Chicago, IL) 280 (7): 605–13.</w:t>
       </w:r>
     </w:p>
-    <w:bookmarkEnd w:id="85"/>
-    <w:bookmarkStart w:id="87" w:name="ref-rosenbaum1983central"/>
+    <w:bookmarkEnd w:id="92"/>
+    <w:bookmarkStart w:id="93" w:name="ref-statrethink2e"/>
     <w:p>
       <w:pPr>
         <w:pStyle w:val="Bibliography"/>
       </w:pPr>
       <w:r>
-        <w:t xml:space="preserve">Rosenbaum, Paul R., and Donald B. Rubin. 1983.</w:t>
-      </w:r>
-      <w:r>
-        <w:t xml:space="preserve"> </w:t>
-      </w:r>
-      <w:r>
-        <w:t xml:space="preserve">“The Central Role of the Propensity Score in Observational Studies for Causal Effects.”</w:t>
+        <w:t xml:space="preserve">McElreath, Richard. 2020.</w:t>
       </w:r>
       <w:r>
         <w:t xml:space="preserve"> </w:t>
@@ -27060,6 +27390,142 @@
           <w:i/>
           <w:iCs/>
         </w:rPr>
+        <w:t xml:space="preserve">Statistical Rethinking : A</w:t>
+      </w:r>
+      <w:r>
+        <w:rPr>
+          <w:i/>
+          <w:iCs/>
+        </w:rPr>
+        <w:t xml:space="preserve"> </w:t>
+      </w:r>
+      <w:r>
+        <w:rPr>
+          <w:i/>
+          <w:iCs/>
+        </w:rPr>
+        <w:t xml:space="preserve">Bayesian</w:t>
+      </w:r>
+      <w:r>
+        <w:rPr>
+          <w:i/>
+          <w:iCs/>
+        </w:rPr>
+        <w:t xml:space="preserve"> </w:t>
+      </w:r>
+      <w:r>
+        <w:rPr>
+          <w:i/>
+          <w:iCs/>
+        </w:rPr>
+        <w:t xml:space="preserve">Course with Examples in</w:t>
+      </w:r>
+      <w:r>
+        <w:rPr>
+          <w:i/>
+          <w:iCs/>
+        </w:rPr>
+        <w:t xml:space="preserve"> </w:t>
+      </w:r>
+      <w:r>
+        <w:rPr>
+          <w:i/>
+          <w:iCs/>
+        </w:rPr>
+        <w:t xml:space="preserve">R</w:t>
+      </w:r>
+      <w:r>
+        <w:rPr>
+          <w:i/>
+          <w:iCs/>
+        </w:rPr>
+        <w:t xml:space="preserve"> </w:t>
+      </w:r>
+      <w:r>
+        <w:rPr>
+          <w:i/>
+          <w:iCs/>
+        </w:rPr>
+        <w:t xml:space="preserve">and</w:t>
+      </w:r>
+      <w:r>
+        <w:rPr>
+          <w:i/>
+          <w:iCs/>
+        </w:rPr>
+        <w:t xml:space="preserve"> </w:t>
+      </w:r>
+      <w:r>
+        <w:rPr>
+          <w:i/>
+          <w:iCs/>
+        </w:rPr>
+        <w:t xml:space="preserve">Stan</w:t>
+      </w:r>
+      <w:r>
+        <w:t xml:space="preserve">. Second edition. Chapman &amp; Hall/CRC Texts in Statistical Science Series. CRC Press.</w:t>
+      </w:r>
+    </w:p>
+    <w:bookmarkEnd w:id="93"/>
+    <w:bookmarkStart w:id="95" w:name="ref-mcelreath2026rethinking"/>
+    <w:p>
+      <w:pPr>
+        <w:pStyle w:val="Bibliography"/>
+      </w:pPr>
+      <w:r>
+        <w:t xml:space="preserve">McElreath, Richard. 2026.</w:t>
+      </w:r>
+      <w:r>
+        <w:t xml:space="preserve"> </w:t>
+      </w:r>
+      <w:r>
+        <w:rPr>
+          <w:i/>
+          <w:iCs/>
+        </w:rPr>
+        <w:t xml:space="preserve">Statistical Rethinking 2026</w:t>
+      </w:r>
+      <w:r>
+        <w:t xml:space="preserve">. Lecture videos, YouTube.</w:t>
+      </w:r>
+      <w:r>
+        <w:t xml:space="preserve"> </w:t>
+      </w:r>
+      <w:hyperlink r:id="rId94">
+        <w:r>
+          <w:rPr>
+            <w:rStyle w:val="Hyperlink"/>
+          </w:rPr>
+          <w:t xml:space="preserve">https://github.com/rmcelreath/stat_rethinking_2026</w:t>
+        </w:r>
+      </w:hyperlink>
+      <w:r>
+        <w:t xml:space="preserve">.</w:t>
+      </w:r>
+    </w:p>
+    <w:bookmarkEnd w:id="95"/>
+    <w:bookmarkStart w:id="97" w:name="ref-rosenbaum1983central"/>
+    <w:p>
+      <w:pPr>
+        <w:pStyle w:val="Bibliography"/>
+      </w:pPr>
+      <w:r>
+        <w:t xml:space="preserve">Rosenbaum, Paul R., and Donald B. Rubin. 1983.</w:t>
+      </w:r>
+      <w:r>
+        <w:t xml:space="preserve"> </w:t>
+      </w:r>
+      <w:r>
+        <w:t xml:space="preserve">“The Central Role of the Propensity Score in Observational Studies for Causal Effects.”</w:t>
+      </w:r>
+      <w:r>
+        <w:t xml:space="preserve"> </w:t>
+      </w:r>
+      <w:r>
+        <w:rPr>
+          <w:i/>
+          <w:iCs/>
+        </w:rPr>
         <w:t xml:space="preserve">Biometrika</w:t>
       </w:r>
       <w:r>
@@ -27071,7 +27537,7 @@
       <w:r>
         <w:t xml:space="preserve"> </w:t>
       </w:r>
-      <w:hyperlink r:id="rId86">
+      <w:hyperlink r:id="rId96">
         <w:r>
           <w:rPr>
             <w:rStyle w:val="Hyperlink"/>
@@ -27083,8 +27549,8 @@
         <w:t xml:space="preserve">.</w:t>
       </w:r>
     </w:p>
-    <w:bookmarkEnd w:id="87"/>
-    <w:bookmarkStart w:id="89" w:name="ref-rosenman1975coronary"/>
+    <w:bookmarkEnd w:id="97"/>
+    <w:bookmarkStart w:id="99" w:name="ref-rosenman1975coronary"/>
     <w:p>
       <w:pPr>
         <w:pStyle w:val="Bibliography"/>
@@ -27126,7 +27592,7 @@
       <w:r>
         <w:t xml:space="preserve"> </w:t>
       </w:r>
-      <w:hyperlink r:id="rId88">
+      <w:hyperlink r:id="rId98">
         <w:r>
           <w:rPr>
             <w:rStyle w:val="Hyperlink"/>
@@ -27138,8 +27604,8 @@
         <w:t xml:space="preserve">.</w:t>
       </w:r>
     </w:p>
-    <w:bookmarkEnd w:id="89"/>
-    <w:bookmarkStart w:id="91" w:name="ref-rubin1974estimating"/>
+    <w:bookmarkEnd w:id="99"/>
+    <w:bookmarkStart w:id="101" w:name="ref-rubin1974estimating"/>
     <w:p>
       <w:pPr>
         <w:pStyle w:val="Bibliography"/>
@@ -27172,7 +27638,7 @@
       <w:r>
         <w:t xml:space="preserve"> </w:t>
       </w:r>
-      <w:hyperlink r:id="rId90">
+      <w:hyperlink r:id="rId100">
         <w:r>
           <w:rPr>
             <w:rStyle w:val="Hyperlink"/>
@@ -27184,8 +27650,8 @@
         <w:t xml:space="preserve">.</w:t>
       </w:r>
     </w:p>
-    <w:bookmarkEnd w:id="91"/>
-    <w:bookmarkStart w:id="93" w:name="ref-vittinghoff2e"/>
+    <w:bookmarkEnd w:id="101"/>
+    <w:bookmarkStart w:id="103" w:name="ref-vittinghoff2e"/>
     <w:p>
       <w:pPr>
         <w:pStyle w:val="Bibliography"/>
@@ -27209,7 +27675,7 @@
       <w:r>
         <w:t xml:space="preserve"> </w:t>
       </w:r>
-      <w:hyperlink r:id="rId92">
+      <w:hyperlink r:id="rId102">
         <w:r>
           <w:rPr>
             <w:rStyle w:val="Hyperlink"/>
@@ -27221,9 +27687,9 @@
         <w:t xml:space="preserve">.</w:t>
       </w:r>
     </w:p>
-    <w:bookmarkEnd w:id="93"/>
-    <w:bookmarkEnd w:id="94"/>
-    <w:bookmarkEnd w:id="95"/>
+    <w:bookmarkEnd w:id="103"/>
+    <w:bookmarkEnd w:id="104"/>
+    <w:bookmarkEnd w:id="105"/>
     <w:sectPr>
       <w:footnotePr>
         <w:numRestart w:val="eachSect"/>

</xml_diff>

<commit_message>
Deploying to gh-pages from @ Morrison-Lab/rme@bda496a4ce1c1f795a19f8dad8c4c097f403df31 🚀
</commit_message>
<xml_diff>
--- a/chapters/causal-inference.docx
+++ b/chapters/causal-inference.docx
@@ -14822,7 +14822,7 @@
         <w:t xml:space="preserve"> </w:t>
       </w:r>
       <w:r>
-        <w:t xml:space="preserve">Women were followed for an average of 4.1 years</w:t>
+        <w:t xml:space="preserve">Women were followed for a sample mean of 4.1 years</w:t>
       </w:r>
       <w:r>
         <w:t xml:space="preserve"> </w:t>
@@ -20534,7 +20534,7 @@
         <w:t xml:space="preserve"> </w:t>
       </w:r>
       <w:r>
-        <w:t xml:space="preserve">Women were followed for an average of 4.1 years</w:t>
+        <w:t xml:space="preserve">Women were followed for a sample mean of 4.1 years</w:t>
       </w:r>
       <w:r>
         <w:t xml:space="preserve"> </w:t>

</xml_diff>